<commit_message>
style(shortest_paths_algorithms): small tweaks to graph rendering
- graph_draw/graph.py: add amplify_entries param to load_graph, so callers
  can opt out of the entry-offset exaggeration (used by zoomed views)
- regions_graph.py: draw bridge platforms as diamonds instead of circles,
  relabel "Bridge" to "Bridge vertices"
- extracted_nodes_graph.py: bump endpoint/bridge marker sizes
- a_star.py, h_cheat.py: docstring wording tweaks;
</commit_message>
<xml_diff>
--- a/.docu/Construcció del graf.docx
+++ b/.docu/Construcció del graf.docx
@@ -566,14 +566,7 @@
           <w:rFonts w:ascii="Arial" w:hAnsi="Arial" w:cs="Arial"/>
           <w:lang w:val="ca-ES"/>
         </w:rPr>
-        <w:t xml:space="preserve"> mai passarà que arribant pel Liceu en la direcció Trinitat Nova hagis de canviar de sentit per anar en direcció Zona Universitària. Per tant, n</w:t>
-      </w:r>
-      <w:r>
-        <w:rPr>
-          <w:rFonts w:ascii="Arial" w:hAnsi="Arial" w:cs="Arial"/>
-          <w:lang w:val="ca-ES"/>
-        </w:rPr>
-        <w:t xml:space="preserve">omés afecta quan la </w:t>
+        <w:t xml:space="preserve"> mai passarà que arribant pel Liceu en la direcció Trinitat Nova hagis de canviar de sentit per anar en direcció Zona Universitària. Per tant, només afecta quan la </w:t>
       </w:r>
       <w:proofErr w:type="spellStart"/>
       <w:r>
@@ -639,6 +632,14 @@
         </w:rPr>
         <w:t>Característiques del graf</w:t>
       </w:r>
+      <w:r>
+        <w:rPr>
+          <w:rFonts w:ascii="Arial" w:hAnsi="Arial" w:cs="Arial"/>
+          <w:b/>
+          <w:bCs/>
+        </w:rPr>
+        <w:t xml:space="preserve"> i implicacions</w:t>
+      </w:r>
     </w:p>
     <w:p>
       <w:pPr>
@@ -662,13 +663,7 @@
         <w:rPr>
           <w:rFonts w:ascii="Arial" w:hAnsi="Arial" w:cs="Arial"/>
         </w:rPr>
-        <w:t xml:space="preserve">’, </w:t>
-      </w:r>
-      <w:r>
-        <w:rPr>
-          <w:rFonts w:ascii="Arial" w:hAnsi="Arial" w:cs="Arial"/>
-        </w:rPr>
-        <w:t>les característiques principals del nostre graf són:</w:t>
+        <w:t>’, les característiques principals del nostre graf són:</w:t>
       </w:r>
     </w:p>
     <w:p>
@@ -704,7 +699,19 @@
         <w:rPr>
           <w:rFonts w:ascii="Arial" w:hAnsi="Arial" w:cs="Arial"/>
         </w:rPr>
-        <w:t>Cada entrada només està connectada a una o dues plataformes (l’últim cas només es dona en les andanes duplicades de les línies 9 i 10) (vist a ‘</w:t>
+        <w:t>Cada entrada només està connectada a una o dues plataformes (l’últim cas només es dona en les andanes duplicades de les línies 9 i 10) (</w:t>
+      </w:r>
+      <w:r>
+        <w:rPr>
+          <w:rFonts w:ascii="Arial" w:hAnsi="Arial" w:cs="Arial"/>
+        </w:rPr>
+        <w:t xml:space="preserve">fet </w:t>
+      </w:r>
+      <w:r>
+        <w:rPr>
+          <w:rFonts w:ascii="Arial" w:hAnsi="Arial" w:cs="Arial"/>
+        </w:rPr>
+        <w:t>vist a ‘</w:t>
       </w:r>
       <w:r>
         <w:rPr>
@@ -734,7 +741,19 @@
         <w:rPr>
           <w:rFonts w:ascii="Arial" w:hAnsi="Arial" w:cs="Arial"/>
         </w:rPr>
-        <w:t>Les fletxes PW representen el 71.8% del total (1019 de 1419).</w:t>
+        <w:t>Les fletxes PW representen el 71.8% del total</w:t>
+      </w:r>
+      <w:r>
+        <w:rPr>
+          <w:rFonts w:ascii="Arial" w:hAnsi="Arial" w:cs="Arial"/>
+        </w:rPr>
+        <w:t xml:space="preserve"> de les fletxes</w:t>
+      </w:r>
+      <w:r>
+        <w:rPr>
+          <w:rFonts w:ascii="Arial" w:hAnsi="Arial" w:cs="Arial"/>
+        </w:rPr>
+        <w:t xml:space="preserve"> (1019 de 1419).</w:t>
       </w:r>
     </w:p>
     <w:p>
@@ -770,13 +789,7 @@
         <w:rPr>
           <w:rFonts w:ascii="Arial" w:hAnsi="Arial" w:cs="Arial"/>
         </w:rPr>
-        <w:t xml:space="preserve">A banda d’aquestes mètriques, observant la forma del graf i deixant de banda les arestes PW, veiem que la xarxa </w:t>
-      </w:r>
-      <w:r>
-        <w:rPr>
-          <w:rFonts w:ascii="Arial" w:hAnsi="Arial" w:cs="Arial"/>
-        </w:rPr>
-        <w:t>té forma d’una “bola” molt gran amb 8 branques.</w:t>
+        <w:t>A banda d’aquestes mètriques, observant la forma del graf i deixant de banda les arestes PW, veiem que la xarxa té forma d’una “bola” molt gran amb 8 branques.</w:t>
       </w:r>
       <w:r>
         <w:rPr>
@@ -794,97 +807,15 @@
         </w:numPr>
         <w:rPr>
           <w:rFonts w:ascii="Arial" w:hAnsi="Arial" w:cs="Arial"/>
-        </w:rPr>
-      </w:pPr>
-      <w:r>
-        <w:rPr>
-          <w:rFonts w:ascii="Arial" w:hAnsi="Arial" w:cs="Arial"/>
-        </w:rPr>
-        <w:t xml:space="preserve">D’aquí podem dividir el graf en les seccions Center, Branch_L1, Branch_L2, Branch_L5, </w:t>
-      </w:r>
-      <w:r>
-        <w:rPr>
-          <w:rFonts w:ascii="Arial" w:hAnsi="Arial" w:cs="Arial"/>
-        </w:rPr>
-        <w:t>Branch_L</w:t>
-      </w:r>
-      <w:r>
-        <w:rPr>
-          <w:rFonts w:ascii="Arial" w:hAnsi="Arial" w:cs="Arial"/>
-        </w:rPr>
-        <w:t>9S</w:t>
-      </w:r>
-      <w:r>
-        <w:rPr>
-          <w:rFonts w:ascii="Arial" w:hAnsi="Arial" w:cs="Arial"/>
-        </w:rPr>
-        <w:t>, Branch_L</w:t>
-      </w:r>
-      <w:r>
-        <w:rPr>
-          <w:rFonts w:ascii="Arial" w:hAnsi="Arial" w:cs="Arial"/>
-        </w:rPr>
-        <w:t>9N</w:t>
-      </w:r>
-      <w:r>
-        <w:rPr>
-          <w:rFonts w:ascii="Arial" w:hAnsi="Arial" w:cs="Arial"/>
-        </w:rPr>
-        <w:t>,</w:t>
-      </w:r>
-      <w:r>
-        <w:rPr>
-          <w:rFonts w:ascii="Arial" w:hAnsi="Arial" w:cs="Arial"/>
-        </w:rPr>
-        <w:t xml:space="preserve"> </w:t>
-      </w:r>
-      <w:r>
-        <w:rPr>
-          <w:rFonts w:ascii="Arial" w:hAnsi="Arial" w:cs="Arial"/>
-        </w:rPr>
-        <w:t>Branch_L</w:t>
-      </w:r>
-      <w:r>
-        <w:rPr>
-          <w:rFonts w:ascii="Arial" w:hAnsi="Arial" w:cs="Arial"/>
-        </w:rPr>
-        <w:t>10S</w:t>
-      </w:r>
-      <w:r>
-        <w:rPr>
-          <w:rFonts w:ascii="Arial" w:hAnsi="Arial" w:cs="Arial"/>
-        </w:rPr>
-        <w:t>,</w:t>
-      </w:r>
-      <w:r>
-        <w:rPr>
-          <w:rFonts w:ascii="Arial" w:hAnsi="Arial" w:cs="Arial"/>
-        </w:rPr>
-        <w:t xml:space="preserve"> </w:t>
-      </w:r>
-      <w:r>
-        <w:rPr>
-          <w:rFonts w:ascii="Arial" w:hAnsi="Arial" w:cs="Arial"/>
-        </w:rPr>
-        <w:t>Branch_L</w:t>
-      </w:r>
-      <w:r>
-        <w:rPr>
-          <w:rFonts w:ascii="Arial" w:hAnsi="Arial" w:cs="Arial"/>
-        </w:rPr>
-        <w:t>11 i Branch_FM, tal i com estan definides a ‘</w:t>
-      </w:r>
-      <w:r>
-        <w:rPr>
-          <w:rFonts w:ascii="Arial" w:hAnsi="Arial" w:cs="Arial"/>
-        </w:rPr>
-        <w:t>routing_algorithms/a_star/h_bcn/barcelona_divison.py</w:t>
-      </w:r>
-      <w:r>
-        <w:rPr>
-          <w:rFonts w:ascii="Arial" w:hAnsi="Arial" w:cs="Arial"/>
-        </w:rPr>
-        <w:t>’.</w:t>
+          <w:color w:val="808080" w:themeColor="background1" w:themeShade="80"/>
+        </w:rPr>
+      </w:pPr>
+      <w:r>
+        <w:rPr>
+          <w:rFonts w:ascii="Arial" w:hAnsi="Arial" w:cs="Arial"/>
+          <w:color w:val="808080" w:themeColor="background1" w:themeShade="80"/>
+        </w:rPr>
+        <w:t>D’aquí podem dividir el graf en les seccions Center, Branch_L1, Branch_L2, Branch_L5, Branch_L9S, Branch_L9N, Branch_L10S, Branch_L11 i Branch_FM, tal i com estan definides a ‘routing_algorithms/a_star/h_bcn/barcelona_divison.py’.</w:t>
       </w:r>
     </w:p>
     <w:p>
@@ -896,11 +827,13 @@
         </w:numPr>
         <w:rPr>
           <w:rFonts w:ascii="Arial" w:hAnsi="Arial" w:cs="Arial"/>
-        </w:rPr>
-      </w:pPr>
-      <w:r>
-        <w:rPr>
-          <w:rFonts w:ascii="Arial" w:hAnsi="Arial" w:cs="Arial"/>
+          <w:color w:val="808080" w:themeColor="background1" w:themeShade="80"/>
+        </w:rPr>
+      </w:pPr>
+      <w:r>
+        <w:rPr>
+          <w:rFonts w:ascii="Arial" w:hAnsi="Arial" w:cs="Arial"/>
+          <w:color w:val="808080" w:themeColor="background1" w:themeShade="80"/>
         </w:rPr>
         <w:t>Clarament, el conjunt majoritari d’arestes PW i TF es troben al centre.</w:t>
       </w:r>
@@ -957,7 +890,13 @@
         <w:rPr>
           <w:rFonts w:ascii="Arial" w:hAnsi="Arial" w:cs="Arial"/>
         </w:rPr>
-        <w:t>Es podria dir que el graf té molts “forats”</w:t>
+        <w:t>Fixant-nos de nou en el graf de la xarxa (REF_graf_genèric), e</w:t>
+      </w:r>
+      <w:r>
+        <w:rPr>
+          <w:rFonts w:ascii="Arial" w:hAnsi="Arial" w:cs="Arial"/>
+        </w:rPr>
+        <w:t>s podria dir que el graf té molts “forats”</w:t>
       </w:r>
       <w:r>
         <w:rPr>
@@ -970,19 +909,6 @@
           <w:rFonts w:ascii="Arial" w:hAnsi="Arial" w:cs="Arial"/>
         </w:rPr>
         <w:t>.</w:t>
-      </w:r>
-    </w:p>
-    <w:p>
-      <w:pPr>
-        <w:rPr>
-          <w:rFonts w:ascii="Arial" w:hAnsi="Arial" w:cs="Arial"/>
-        </w:rPr>
-      </w:pPr>
-      <w:r>
-        <w:rPr>
-          <w:rFonts w:ascii="Arial" w:hAnsi="Arial" w:cs="Arial"/>
-        </w:rPr>
-        <w:t>Tot això és visible al gràfic NOM generat per ‘graph_inspection/graph_draw/graph.py’.</w:t>
       </w:r>
     </w:p>
     <w:p>
@@ -1002,7 +928,13 @@
         <w:rPr>
           <w:rFonts w:ascii="Arial" w:hAnsi="Arial" w:cs="Arial"/>
         </w:rPr>
-        <w:t>pel Dijkstra i l’A* amb h_cheat</w:t>
+        <w:t>pel Dijkstra i l’A* amb h_</w:t>
+      </w:r>
+      <w:r>
+        <w:rPr>
+          <w:rFonts w:ascii="Arial" w:hAnsi="Arial" w:cs="Arial"/>
+        </w:rPr>
+        <w:t>geo</w:t>
       </w:r>
       <w:r>
         <w:rPr>
@@ -1050,13 +982,13 @@
         <w:rPr>
           <w:rFonts w:ascii="Arial" w:hAnsi="Arial" w:cs="Arial"/>
         </w:rPr>
-        <w:t xml:space="preserve">Ni el Dijkstra ni </w:t>
-      </w:r>
-      <w:r>
-        <w:rPr>
-          <w:rFonts w:ascii="Arial" w:hAnsi="Arial" w:cs="Arial"/>
-        </w:rPr>
-        <w:t>l’A* amb h_cheat</w:t>
+        <w:t>Ni el Dijkstra ni l’A* amb h_</w:t>
+      </w:r>
+      <w:r>
+        <w:rPr>
+          <w:rFonts w:ascii="Arial" w:hAnsi="Arial" w:cs="Arial"/>
+        </w:rPr>
+        <w:t>geo</w:t>
       </w:r>
       <w:r>
         <w:rPr>
@@ -1075,6 +1007,870 @@
         <w:rPr>
           <w:rFonts w:ascii="Arial" w:hAnsi="Arial" w:cs="Arial"/>
         </w:rPr>
+        <w:t xml:space="preserve">Tenint això en ment, el següent pas lògic és definir millor aquesta “topologia” particular, o més ben dit, definir aquesta divisió de zones sobre la xarxa. </w:t>
+      </w:r>
+    </w:p>
+    <w:p>
+      <w:pPr>
+        <w:rPr>
+          <w:rFonts w:ascii="Arial" w:hAnsi="Arial" w:cs="Arial"/>
+        </w:rPr>
+      </w:pPr>
+      <w:r>
+        <w:rPr>
+          <w:rFonts w:ascii="Arial" w:hAnsi="Arial" w:cs="Arial"/>
+        </w:rPr>
+        <w:t xml:space="preserve">Seguint la idea de la bola gran amb 8 cames, podem definir les següents zones </w:t>
+      </w:r>
+    </w:p>
+    <w:p>
+      <w:pPr>
+        <w:pStyle w:val="ListParagraph"/>
+        <w:numPr>
+          <w:ilvl w:val="0"/>
+          <w:numId w:val="5"/>
+        </w:numPr>
+        <w:rPr>
+          <w:rFonts w:ascii="Arial" w:hAnsi="Arial" w:cs="Arial"/>
+        </w:rPr>
+      </w:pPr>
+      <w:r>
+        <w:rPr>
+          <w:rFonts w:ascii="Arial" w:hAnsi="Arial" w:cs="Arial"/>
+        </w:rPr>
+        <w:t>Branch_L1</w:t>
+      </w:r>
+      <w:r>
+        <w:rPr>
+          <w:rFonts w:ascii="Arial" w:hAnsi="Arial" w:cs="Arial"/>
+        </w:rPr>
+        <w:t xml:space="preserve"> com les arestes</w:t>
+      </w:r>
+      <w:r>
+        <w:rPr>
+          <w:rFonts w:ascii="Arial" w:hAnsi="Arial" w:cs="Arial"/>
+        </w:rPr>
+        <w:t xml:space="preserve"> i els vèrtexs</w:t>
+      </w:r>
+      <w:r>
+        <w:rPr>
+          <w:rFonts w:ascii="Arial" w:hAnsi="Arial" w:cs="Arial"/>
+        </w:rPr>
+        <w:t xml:space="preserve"> d</w:t>
+      </w:r>
+      <w:r>
+        <w:rPr>
+          <w:rFonts w:ascii="Arial" w:hAnsi="Arial" w:cs="Arial"/>
+        </w:rPr>
+        <w:t xml:space="preserve">e la parada L1 – </w:t>
+      </w:r>
+      <w:r>
+        <w:rPr>
+          <w:rFonts w:ascii="Arial" w:hAnsi="Arial" w:cs="Arial"/>
+        </w:rPr>
+        <w:t>Hospital</w:t>
+      </w:r>
+      <w:r>
+        <w:rPr>
+          <w:rFonts w:ascii="Arial" w:hAnsi="Arial" w:cs="Arial"/>
+        </w:rPr>
+        <w:t xml:space="preserve"> de Bellvitge </w:t>
+      </w:r>
+      <w:r>
+        <w:rPr>
+          <w:rFonts w:ascii="Arial" w:hAnsi="Arial" w:cs="Arial"/>
+        </w:rPr>
+        <w:t>fins els de la L1 – Florida</w:t>
+      </w:r>
+      <w:r>
+        <w:rPr>
+          <w:rFonts w:ascii="Arial" w:hAnsi="Arial" w:cs="Arial"/>
+        </w:rPr>
+        <w:t xml:space="preserve">, </w:t>
+      </w:r>
+    </w:p>
+    <w:p>
+      <w:pPr>
+        <w:pStyle w:val="ListParagraph"/>
+        <w:numPr>
+          <w:ilvl w:val="0"/>
+          <w:numId w:val="5"/>
+        </w:numPr>
+        <w:rPr>
+          <w:rFonts w:ascii="Arial" w:hAnsi="Arial" w:cs="Arial"/>
+        </w:rPr>
+      </w:pPr>
+      <w:r>
+        <w:rPr>
+          <w:rFonts w:ascii="Arial" w:hAnsi="Arial" w:cs="Arial"/>
+        </w:rPr>
+        <w:t>Branch_L2</w:t>
+      </w:r>
+      <w:r>
+        <w:rPr>
+          <w:rFonts w:ascii="Arial" w:hAnsi="Arial" w:cs="Arial"/>
+        </w:rPr>
+        <w:t xml:space="preserve"> </w:t>
+      </w:r>
+      <w:r>
+        <w:rPr>
+          <w:rFonts w:ascii="Arial" w:hAnsi="Arial" w:cs="Arial"/>
+        </w:rPr>
+        <w:t>com les arestes i els vèrtexs de la parada</w:t>
+      </w:r>
+      <w:r>
+        <w:rPr>
+          <w:rFonts w:ascii="Arial" w:hAnsi="Arial" w:cs="Arial"/>
+        </w:rPr>
+        <w:t xml:space="preserve"> L2 – Badalona Pompeu Fabra fins els de la L2 – Pep Ventura</w:t>
+      </w:r>
+      <w:r>
+        <w:rPr>
+          <w:rFonts w:ascii="Arial" w:hAnsi="Arial" w:cs="Arial"/>
+        </w:rPr>
+        <w:t xml:space="preserve">, </w:t>
+      </w:r>
+    </w:p>
+    <w:p>
+      <w:pPr>
+        <w:pStyle w:val="ListParagraph"/>
+        <w:numPr>
+          <w:ilvl w:val="0"/>
+          <w:numId w:val="5"/>
+        </w:numPr>
+        <w:rPr>
+          <w:rFonts w:ascii="Arial" w:hAnsi="Arial" w:cs="Arial"/>
+        </w:rPr>
+      </w:pPr>
+      <w:r>
+        <w:rPr>
+          <w:rFonts w:ascii="Arial" w:hAnsi="Arial" w:cs="Arial"/>
+        </w:rPr>
+        <w:t>Branch_L5</w:t>
+      </w:r>
+      <w:r>
+        <w:rPr>
+          <w:rFonts w:ascii="Arial" w:hAnsi="Arial" w:cs="Arial"/>
+        </w:rPr>
+        <w:t xml:space="preserve"> </w:t>
+      </w:r>
+      <w:r>
+        <w:rPr>
+          <w:rFonts w:ascii="Arial" w:hAnsi="Arial" w:cs="Arial"/>
+        </w:rPr>
+        <w:t>com les arestes i els vèrtexs de la parada L</w:t>
+      </w:r>
+      <w:r>
+        <w:rPr>
+          <w:rFonts w:ascii="Arial" w:hAnsi="Arial" w:cs="Arial"/>
+        </w:rPr>
+        <w:t>5</w:t>
+      </w:r>
+      <w:r>
+        <w:rPr>
+          <w:rFonts w:ascii="Arial" w:hAnsi="Arial" w:cs="Arial"/>
+        </w:rPr>
+        <w:t xml:space="preserve"> –</w:t>
+      </w:r>
+      <w:r>
+        <w:rPr>
+          <w:rFonts w:ascii="Arial" w:hAnsi="Arial" w:cs="Arial"/>
+        </w:rPr>
+        <w:t xml:space="preserve"> Cornellà Centre fins els de la L5 – Ernest Lluch</w:t>
+      </w:r>
+      <w:r>
+        <w:rPr>
+          <w:rFonts w:ascii="Arial" w:hAnsi="Arial" w:cs="Arial"/>
+        </w:rPr>
+        <w:t xml:space="preserve">, </w:t>
+      </w:r>
+    </w:p>
+    <w:p>
+      <w:pPr>
+        <w:pStyle w:val="ListParagraph"/>
+        <w:numPr>
+          <w:ilvl w:val="0"/>
+          <w:numId w:val="5"/>
+        </w:numPr>
+        <w:rPr>
+          <w:rFonts w:ascii="Arial" w:hAnsi="Arial" w:cs="Arial"/>
+        </w:rPr>
+      </w:pPr>
+      <w:r>
+        <w:rPr>
+          <w:rFonts w:ascii="Arial" w:hAnsi="Arial" w:cs="Arial"/>
+        </w:rPr>
+        <w:t>Branch_L9S</w:t>
+      </w:r>
+      <w:r>
+        <w:rPr>
+          <w:rFonts w:ascii="Arial" w:hAnsi="Arial" w:cs="Arial"/>
+        </w:rPr>
+        <w:t xml:space="preserve"> </w:t>
+      </w:r>
+      <w:r>
+        <w:rPr>
+          <w:rFonts w:ascii="Arial" w:hAnsi="Arial" w:cs="Arial"/>
+        </w:rPr>
+        <w:t>com les arestes i els vèrtexs de la parada L</w:t>
+      </w:r>
+      <w:r>
+        <w:rPr>
+          <w:rFonts w:ascii="Arial" w:hAnsi="Arial" w:cs="Arial"/>
+        </w:rPr>
+        <w:t>9S</w:t>
+      </w:r>
+      <w:r>
+        <w:rPr>
+          <w:rFonts w:ascii="Arial" w:hAnsi="Arial" w:cs="Arial"/>
+        </w:rPr>
+        <w:t xml:space="preserve"> –</w:t>
+      </w:r>
+      <w:r>
+        <w:rPr>
+          <w:rFonts w:ascii="Arial" w:hAnsi="Arial" w:cs="Arial"/>
+        </w:rPr>
+        <w:t xml:space="preserve"> Aeroport T1 fins els de la L9S – Europa | Fira</w:t>
+      </w:r>
+      <w:r>
+        <w:rPr>
+          <w:rFonts w:ascii="Arial" w:hAnsi="Arial" w:cs="Arial"/>
+        </w:rPr>
+        <w:t xml:space="preserve">, </w:t>
+      </w:r>
+    </w:p>
+    <w:p>
+      <w:pPr>
+        <w:pStyle w:val="ListParagraph"/>
+        <w:numPr>
+          <w:ilvl w:val="0"/>
+          <w:numId w:val="5"/>
+        </w:numPr>
+        <w:rPr>
+          <w:rFonts w:ascii="Arial" w:hAnsi="Arial" w:cs="Arial"/>
+        </w:rPr>
+      </w:pPr>
+      <w:r>
+        <w:rPr>
+          <w:rFonts w:ascii="Arial" w:hAnsi="Arial" w:cs="Arial"/>
+        </w:rPr>
+        <w:t>Branch_L9N</w:t>
+      </w:r>
+      <w:r>
+        <w:rPr>
+          <w:rFonts w:ascii="Arial" w:hAnsi="Arial" w:cs="Arial"/>
+        </w:rPr>
+        <w:t xml:space="preserve"> </w:t>
+      </w:r>
+      <w:r>
+        <w:rPr>
+          <w:rFonts w:ascii="Arial" w:hAnsi="Arial" w:cs="Arial"/>
+        </w:rPr>
+        <w:t>com les arestes i els vèrtexs de la parada L</w:t>
+      </w:r>
+      <w:r>
+        <w:rPr>
+          <w:rFonts w:ascii="Arial" w:hAnsi="Arial" w:cs="Arial"/>
+        </w:rPr>
+        <w:t>9N</w:t>
+      </w:r>
+      <w:r>
+        <w:rPr>
+          <w:rFonts w:ascii="Arial" w:hAnsi="Arial" w:cs="Arial"/>
+        </w:rPr>
+        <w:t xml:space="preserve"> –</w:t>
+      </w:r>
+      <w:r>
+        <w:rPr>
+          <w:rFonts w:ascii="Arial" w:hAnsi="Arial" w:cs="Arial"/>
+        </w:rPr>
+        <w:t xml:space="preserve"> Can Zam fins els de la L9N – Esgésia Major</w:t>
+      </w:r>
+      <w:r>
+        <w:rPr>
+          <w:rFonts w:ascii="Arial" w:hAnsi="Arial" w:cs="Arial"/>
+        </w:rPr>
+        <w:t xml:space="preserve">, </w:t>
+      </w:r>
+    </w:p>
+    <w:p>
+      <w:pPr>
+        <w:pStyle w:val="ListParagraph"/>
+        <w:numPr>
+          <w:ilvl w:val="0"/>
+          <w:numId w:val="5"/>
+        </w:numPr>
+        <w:rPr>
+          <w:rFonts w:ascii="Arial" w:hAnsi="Arial" w:cs="Arial"/>
+        </w:rPr>
+      </w:pPr>
+      <w:r>
+        <w:rPr>
+          <w:rFonts w:ascii="Arial" w:hAnsi="Arial" w:cs="Arial"/>
+        </w:rPr>
+        <w:t>Branch_L10S</w:t>
+      </w:r>
+      <w:r>
+        <w:rPr>
+          <w:rFonts w:ascii="Arial" w:hAnsi="Arial" w:cs="Arial"/>
+        </w:rPr>
+        <w:t xml:space="preserve"> </w:t>
+      </w:r>
+      <w:r>
+        <w:rPr>
+          <w:rFonts w:ascii="Arial" w:hAnsi="Arial" w:cs="Arial"/>
+        </w:rPr>
+        <w:t>com les arestes i els vèrtexs de la parada L</w:t>
+      </w:r>
+      <w:r>
+        <w:rPr>
+          <w:rFonts w:ascii="Arial" w:hAnsi="Arial" w:cs="Arial"/>
+        </w:rPr>
+        <w:t>10S</w:t>
+      </w:r>
+      <w:r>
+        <w:rPr>
+          <w:rFonts w:ascii="Arial" w:hAnsi="Arial" w:cs="Arial"/>
+        </w:rPr>
+        <w:t xml:space="preserve"> –</w:t>
+      </w:r>
+      <w:r>
+        <w:rPr>
+          <w:rFonts w:ascii="Arial" w:hAnsi="Arial" w:cs="Arial"/>
+        </w:rPr>
+        <w:t xml:space="preserve"> ZAL | Riu Vell fins els de la L10S – Provençana</w:t>
+      </w:r>
+      <w:r>
+        <w:rPr>
+          <w:rFonts w:ascii="Arial" w:hAnsi="Arial" w:cs="Arial"/>
+        </w:rPr>
+        <w:t xml:space="preserve">, </w:t>
+      </w:r>
+    </w:p>
+    <w:p>
+      <w:pPr>
+        <w:pStyle w:val="ListParagraph"/>
+        <w:numPr>
+          <w:ilvl w:val="0"/>
+          <w:numId w:val="5"/>
+        </w:numPr>
+        <w:rPr>
+          <w:rFonts w:ascii="Arial" w:hAnsi="Arial" w:cs="Arial"/>
+        </w:rPr>
+      </w:pPr>
+      <w:r>
+        <w:rPr>
+          <w:rFonts w:ascii="Arial" w:hAnsi="Arial" w:cs="Arial"/>
+        </w:rPr>
+        <w:t xml:space="preserve">Branch_L11 </w:t>
+      </w:r>
+      <w:r>
+        <w:rPr>
+          <w:rFonts w:ascii="Arial" w:hAnsi="Arial" w:cs="Arial"/>
+        </w:rPr>
+        <w:t>com les arestes i els vèrtexs de la parada L1</w:t>
+      </w:r>
+      <w:r>
+        <w:rPr>
+          <w:rFonts w:ascii="Arial" w:hAnsi="Arial" w:cs="Arial"/>
+        </w:rPr>
+        <w:t>1</w:t>
+      </w:r>
+      <w:r>
+        <w:rPr>
+          <w:rFonts w:ascii="Arial" w:hAnsi="Arial" w:cs="Arial"/>
+        </w:rPr>
+        <w:t xml:space="preserve"> – </w:t>
+      </w:r>
+      <w:r>
+        <w:rPr>
+          <w:rFonts w:ascii="Arial" w:hAnsi="Arial" w:cs="Arial"/>
+        </w:rPr>
+        <w:t>Can Cuiàs</w:t>
+      </w:r>
+      <w:r>
+        <w:rPr>
+          <w:rFonts w:ascii="Arial" w:hAnsi="Arial" w:cs="Arial"/>
+        </w:rPr>
+        <w:t xml:space="preserve"> fins els de la L1</w:t>
+      </w:r>
+      <w:r>
+        <w:rPr>
+          <w:rFonts w:ascii="Arial" w:hAnsi="Arial" w:cs="Arial"/>
+        </w:rPr>
+        <w:t xml:space="preserve">1 </w:t>
+      </w:r>
+      <w:r>
+        <w:rPr>
+          <w:rFonts w:ascii="Arial" w:hAnsi="Arial" w:cs="Arial"/>
+        </w:rPr>
+        <w:t>–</w:t>
+      </w:r>
+      <w:r>
+        <w:rPr>
+          <w:rFonts w:ascii="Arial" w:hAnsi="Arial" w:cs="Arial"/>
+        </w:rPr>
+        <w:t xml:space="preserve"> Casa</w:t>
+      </w:r>
+      <w:r>
+        <w:rPr>
+          <w:rFonts w:ascii="Arial" w:hAnsi="Arial" w:cs="Arial"/>
+        </w:rPr>
+        <w:t xml:space="preserve"> de l’Aigua, </w:t>
+      </w:r>
+    </w:p>
+    <w:p>
+      <w:pPr>
+        <w:pStyle w:val="ListParagraph"/>
+        <w:numPr>
+          <w:ilvl w:val="0"/>
+          <w:numId w:val="5"/>
+        </w:numPr>
+        <w:rPr>
+          <w:rFonts w:ascii="Arial" w:hAnsi="Arial" w:cs="Arial"/>
+        </w:rPr>
+      </w:pPr>
+      <w:r>
+        <w:rPr>
+          <w:rFonts w:ascii="Arial" w:hAnsi="Arial" w:cs="Arial"/>
+        </w:rPr>
+        <w:t>Branch_FM</w:t>
+      </w:r>
+      <w:r>
+        <w:rPr>
+          <w:rFonts w:ascii="Arial" w:hAnsi="Arial" w:cs="Arial"/>
+        </w:rPr>
+        <w:t xml:space="preserve"> com les arestes i els vèrtexs de la parada FM – Parc Montjuïc, i</w:t>
+      </w:r>
+    </w:p>
+    <w:p>
+      <w:pPr>
+        <w:pStyle w:val="ListParagraph"/>
+        <w:numPr>
+          <w:ilvl w:val="0"/>
+          <w:numId w:val="5"/>
+        </w:numPr>
+        <w:rPr>
+          <w:rFonts w:ascii="Arial" w:hAnsi="Arial" w:cs="Arial"/>
+        </w:rPr>
+      </w:pPr>
+      <w:r>
+        <w:rPr>
+          <w:rFonts w:ascii="Arial" w:hAnsi="Arial" w:cs="Arial"/>
+        </w:rPr>
+        <w:t>Center com la resta del graf.</w:t>
+      </w:r>
+    </w:p>
+    <w:p>
+      <w:pPr>
+        <w:rPr>
+          <w:rFonts w:ascii="Arial" w:hAnsi="Arial" w:cs="Arial"/>
+        </w:rPr>
+      </w:pPr>
+      <w:r>
+        <w:rPr>
+          <w:rFonts w:ascii="Arial" w:hAnsi="Arial" w:cs="Arial"/>
+        </w:rPr>
+        <w:t>Clarament, el conjunt majoritari d’arestes PW i TF es troben al centre.</w:t>
+      </w:r>
+    </w:p>
+    <w:p>
+      <w:pPr>
+        <w:rPr>
+          <w:rFonts w:ascii="Arial" w:hAnsi="Arial" w:cs="Arial"/>
+        </w:rPr>
+      </w:pPr>
+      <w:r>
+        <w:rPr>
+          <w:rFonts w:ascii="Arial" w:hAnsi="Arial" w:cs="Arial"/>
+        </w:rPr>
+        <w:t xml:space="preserve">Cada branca està connectada per un pont al centre: la Branch_L1 té la parada L1 – Torrassa, la Branch_L2 té la parada L2 – Gorg, </w:t>
+      </w:r>
+      <w:r>
+        <w:rPr>
+          <w:rFonts w:ascii="Arial" w:hAnsi="Arial" w:cs="Arial"/>
+        </w:rPr>
+        <w:t>la Branch_L</w:t>
+      </w:r>
+      <w:r>
+        <w:rPr>
+          <w:rFonts w:ascii="Arial" w:hAnsi="Arial" w:cs="Arial"/>
+        </w:rPr>
+        <w:t>5</w:t>
+      </w:r>
+      <w:r>
+        <w:rPr>
+          <w:rFonts w:ascii="Arial" w:hAnsi="Arial" w:cs="Arial"/>
+        </w:rPr>
+        <w:t xml:space="preserve"> té la parada L</w:t>
+      </w:r>
+      <w:r>
+        <w:rPr>
+          <w:rFonts w:ascii="Arial" w:hAnsi="Arial" w:cs="Arial"/>
+        </w:rPr>
+        <w:t>5</w:t>
+      </w:r>
+      <w:r>
+        <w:rPr>
+          <w:rFonts w:ascii="Arial" w:hAnsi="Arial" w:cs="Arial"/>
+        </w:rPr>
+        <w:t xml:space="preserve"> – </w:t>
+      </w:r>
+      <w:r>
+        <w:rPr>
+          <w:rFonts w:ascii="Arial" w:hAnsi="Arial" w:cs="Arial"/>
+        </w:rPr>
+        <w:t>Collblanc</w:t>
+      </w:r>
+      <w:r>
+        <w:rPr>
+          <w:rFonts w:ascii="Arial" w:hAnsi="Arial" w:cs="Arial"/>
+        </w:rPr>
+        <w:t>,</w:t>
+      </w:r>
+      <w:r>
+        <w:rPr>
+          <w:rFonts w:ascii="Arial" w:hAnsi="Arial" w:cs="Arial"/>
+        </w:rPr>
+        <w:t xml:space="preserve"> </w:t>
+      </w:r>
+      <w:r>
+        <w:rPr>
+          <w:rFonts w:ascii="Arial" w:hAnsi="Arial" w:cs="Arial"/>
+        </w:rPr>
+        <w:t>la Branch_</w:t>
+      </w:r>
+      <w:r>
+        <w:rPr>
+          <w:rFonts w:ascii="Arial" w:hAnsi="Arial" w:cs="Arial"/>
+        </w:rPr>
+        <w:t>L9S</w:t>
+      </w:r>
+      <w:r>
+        <w:rPr>
+          <w:rFonts w:ascii="Arial" w:hAnsi="Arial" w:cs="Arial"/>
+        </w:rPr>
+        <w:t xml:space="preserve"> té la parada L</w:t>
+      </w:r>
+      <w:r>
+        <w:rPr>
+          <w:rFonts w:ascii="Arial" w:hAnsi="Arial" w:cs="Arial"/>
+        </w:rPr>
+        <w:t>9S</w:t>
+      </w:r>
+      <w:r>
+        <w:rPr>
+          <w:rFonts w:ascii="Arial" w:hAnsi="Arial" w:cs="Arial"/>
+        </w:rPr>
+        <w:t xml:space="preserve"> – </w:t>
+      </w:r>
+      <w:r>
+        <w:rPr>
+          <w:rFonts w:ascii="Arial" w:hAnsi="Arial" w:cs="Arial"/>
+        </w:rPr>
+        <w:t>Can Tries | Gornal</w:t>
+      </w:r>
+      <w:r>
+        <w:rPr>
+          <w:rFonts w:ascii="Arial" w:hAnsi="Arial" w:cs="Arial"/>
+        </w:rPr>
+        <w:t>,</w:t>
+      </w:r>
+      <w:r>
+        <w:rPr>
+          <w:rFonts w:ascii="Arial" w:hAnsi="Arial" w:cs="Arial"/>
+        </w:rPr>
+        <w:t xml:space="preserve"> </w:t>
+      </w:r>
+      <w:r>
+        <w:rPr>
+          <w:rFonts w:ascii="Arial" w:hAnsi="Arial" w:cs="Arial"/>
+        </w:rPr>
+        <w:t>la Branch_L</w:t>
+      </w:r>
+      <w:r>
+        <w:rPr>
+          <w:rFonts w:ascii="Arial" w:hAnsi="Arial" w:cs="Arial"/>
+        </w:rPr>
+        <w:t>9N</w:t>
+      </w:r>
+      <w:r>
+        <w:rPr>
+          <w:rFonts w:ascii="Arial" w:hAnsi="Arial" w:cs="Arial"/>
+        </w:rPr>
+        <w:t xml:space="preserve"> té la parada L</w:t>
+      </w:r>
+      <w:r>
+        <w:rPr>
+          <w:rFonts w:ascii="Arial" w:hAnsi="Arial" w:cs="Arial"/>
+        </w:rPr>
+        <w:t>9N</w:t>
+      </w:r>
+      <w:r>
+        <w:rPr>
+          <w:rFonts w:ascii="Arial" w:hAnsi="Arial" w:cs="Arial"/>
+        </w:rPr>
+        <w:t xml:space="preserve"> – </w:t>
+      </w:r>
+      <w:r>
+        <w:rPr>
+          <w:rFonts w:ascii="Arial" w:hAnsi="Arial" w:cs="Arial"/>
+        </w:rPr>
+        <w:t>Fondo</w:t>
+      </w:r>
+      <w:r>
+        <w:rPr>
+          <w:rFonts w:ascii="Arial" w:hAnsi="Arial" w:cs="Arial"/>
+        </w:rPr>
+        <w:t>,</w:t>
+      </w:r>
+      <w:r>
+        <w:rPr>
+          <w:rFonts w:ascii="Arial" w:hAnsi="Arial" w:cs="Arial"/>
+        </w:rPr>
+        <w:t xml:space="preserve"> </w:t>
+      </w:r>
+      <w:r>
+        <w:rPr>
+          <w:rFonts w:ascii="Arial" w:hAnsi="Arial" w:cs="Arial"/>
+        </w:rPr>
+        <w:t>la Branch_L</w:t>
+      </w:r>
+      <w:r>
+        <w:rPr>
+          <w:rFonts w:ascii="Arial" w:hAnsi="Arial" w:cs="Arial"/>
+        </w:rPr>
+        <w:t>10S</w:t>
+      </w:r>
+      <w:r>
+        <w:rPr>
+          <w:rFonts w:ascii="Arial" w:hAnsi="Arial" w:cs="Arial"/>
+        </w:rPr>
+        <w:t xml:space="preserve"> té la parada L</w:t>
+      </w:r>
+      <w:r>
+        <w:rPr>
+          <w:rFonts w:ascii="Arial" w:hAnsi="Arial" w:cs="Arial"/>
+        </w:rPr>
+        <w:t>10S</w:t>
+      </w:r>
+      <w:r>
+        <w:rPr>
+          <w:rFonts w:ascii="Arial" w:hAnsi="Arial" w:cs="Arial"/>
+        </w:rPr>
+        <w:t xml:space="preserve"> –</w:t>
+      </w:r>
+      <w:r>
+        <w:rPr>
+          <w:rFonts w:ascii="Arial" w:hAnsi="Arial" w:cs="Arial"/>
+        </w:rPr>
+        <w:t xml:space="preserve"> </w:t>
+      </w:r>
+      <w:r>
+        <w:rPr>
+          <w:rFonts w:ascii="Arial" w:hAnsi="Arial" w:cs="Arial"/>
+        </w:rPr>
+        <w:t>Can Tries | Gornal,</w:t>
+      </w:r>
+      <w:r>
+        <w:rPr>
+          <w:rFonts w:ascii="Arial" w:hAnsi="Arial" w:cs="Arial"/>
+        </w:rPr>
+        <w:t xml:space="preserve"> </w:t>
+      </w:r>
+      <w:r>
+        <w:rPr>
+          <w:rFonts w:ascii="Arial" w:hAnsi="Arial" w:cs="Arial"/>
+        </w:rPr>
+        <w:t>la Branch_L</w:t>
+      </w:r>
+      <w:r>
+        <w:rPr>
+          <w:rFonts w:ascii="Arial" w:hAnsi="Arial" w:cs="Arial"/>
+        </w:rPr>
+        <w:t>11</w:t>
+      </w:r>
+      <w:r>
+        <w:rPr>
+          <w:rFonts w:ascii="Arial" w:hAnsi="Arial" w:cs="Arial"/>
+        </w:rPr>
+        <w:t xml:space="preserve"> té la parada L</w:t>
+      </w:r>
+      <w:r>
+        <w:rPr>
+          <w:rFonts w:ascii="Arial" w:hAnsi="Arial" w:cs="Arial"/>
+        </w:rPr>
+        <w:t>11</w:t>
+      </w:r>
+      <w:r>
+        <w:rPr>
+          <w:rFonts w:ascii="Arial" w:hAnsi="Arial" w:cs="Arial"/>
+        </w:rPr>
+        <w:t xml:space="preserve"> – </w:t>
+      </w:r>
+      <w:r>
+        <w:rPr>
+          <w:rFonts w:ascii="Arial" w:hAnsi="Arial" w:cs="Arial"/>
+        </w:rPr>
+        <w:t>Trinitat Nova i</w:t>
+      </w:r>
+      <w:r>
+        <w:rPr>
+          <w:rFonts w:ascii="Arial" w:hAnsi="Arial" w:cs="Arial"/>
+        </w:rPr>
+        <w:t xml:space="preserve"> </w:t>
+      </w:r>
+      <w:r>
+        <w:rPr>
+          <w:rFonts w:ascii="Arial" w:hAnsi="Arial" w:cs="Arial"/>
+        </w:rPr>
+        <w:t>la Branch_</w:t>
+      </w:r>
+      <w:r>
+        <w:rPr>
+          <w:rFonts w:ascii="Arial" w:hAnsi="Arial" w:cs="Arial"/>
+        </w:rPr>
+        <w:t>FM</w:t>
+      </w:r>
+      <w:r>
+        <w:rPr>
+          <w:rFonts w:ascii="Arial" w:hAnsi="Arial" w:cs="Arial"/>
+        </w:rPr>
+        <w:t xml:space="preserve"> té la parada </w:t>
+      </w:r>
+      <w:r>
+        <w:rPr>
+          <w:rFonts w:ascii="Arial" w:hAnsi="Arial" w:cs="Arial"/>
+        </w:rPr>
+        <w:t>FM</w:t>
+      </w:r>
+      <w:r>
+        <w:rPr>
+          <w:rFonts w:ascii="Arial" w:hAnsi="Arial" w:cs="Arial"/>
+        </w:rPr>
+        <w:t xml:space="preserve"> – </w:t>
+      </w:r>
+      <w:r>
+        <w:rPr>
+          <w:rFonts w:ascii="Arial" w:hAnsi="Arial" w:cs="Arial"/>
+        </w:rPr>
+        <w:t xml:space="preserve">Paral·lel. Cal recalcar que la diferència entre aquest pont i la resta de la branca és que, les parades de la branca només estan connectades entre elles i el pont ja té miním una altra connexió a una altra línia. </w:t>
+      </w:r>
+    </w:p>
+    <w:p>
+      <w:pPr>
+        <w:rPr>
+          <w:rFonts w:ascii="Arial" w:hAnsi="Arial" w:cs="Arial"/>
+        </w:rPr>
+      </w:pPr>
+      <w:r>
+        <w:rPr>
+          <w:rFonts w:ascii="Arial" w:hAnsi="Arial" w:cs="Arial"/>
+        </w:rPr>
+        <w:t>Aquesta divisió es pot veure clarament a la figura (REF) generada per (REF ‘</w:t>
+      </w:r>
+      <w:r>
+        <w:rPr>
+          <w:rFonts w:ascii="Arial" w:hAnsi="Arial" w:cs="Arial"/>
+        </w:rPr>
+        <w:t>shortest_paths_algorithms/analysis/regions_graph.py</w:t>
+      </w:r>
+      <w:r>
+        <w:rPr>
+          <w:rFonts w:ascii="Arial" w:hAnsi="Arial" w:cs="Arial"/>
+        </w:rPr>
+        <w:t xml:space="preserve">’) a partir de (REF </w:t>
+      </w:r>
+      <w:r>
+        <w:rPr>
+          <w:rFonts w:ascii="Arial" w:hAnsi="Arial" w:cs="Arial"/>
+        </w:rPr>
+        <w:t>‘</w:t>
+      </w:r>
+      <w:r>
+        <w:rPr>
+          <w:rFonts w:ascii="Arial" w:hAnsi="Arial" w:cs="Arial"/>
+        </w:rPr>
+        <w:t>shortest_paths_algorithms/barcelona_division.py</w:t>
+      </w:r>
+      <w:r>
+        <w:rPr>
+          <w:rFonts w:ascii="Arial" w:hAnsi="Arial" w:cs="Arial"/>
+        </w:rPr>
+        <w:t>’</w:t>
+      </w:r>
+      <w:r>
+        <w:rPr>
+          <w:rFonts w:ascii="Arial" w:hAnsi="Arial" w:cs="Arial"/>
+        </w:rPr>
+        <w:t>)</w:t>
+      </w:r>
+      <w:r>
+        <w:rPr>
+          <w:rFonts w:ascii="Arial" w:hAnsi="Arial" w:cs="Arial"/>
+        </w:rPr>
+        <w:t>.</w:t>
+      </w:r>
+    </w:p>
+    <w:p>
+      <w:pPr>
+        <w:rPr>
+          <w:rFonts w:ascii="Arial" w:hAnsi="Arial" w:cs="Arial"/>
+        </w:rPr>
+      </w:pPr>
+    </w:p>
+    <w:p>
+      <w:pPr>
+        <w:rPr>
+          <w:rFonts w:ascii="Arial" w:hAnsi="Arial" w:cs="Arial"/>
+        </w:rPr>
+      </w:pPr>
+      <w:r>
+        <w:rPr>
+          <w:rFonts w:ascii="Arial" w:hAnsi="Arial" w:cs="Arial"/>
+        </w:rPr>
+        <w:lastRenderedPageBreak/>
+        <w:t>DIR QUE A PARTIR DELS REPORTS VEIEM QUE LA TOPOLOGIA SÍ IMPORTA</w:t>
+      </w:r>
+    </w:p>
+    <w:p>
+      <w:pPr>
+        <w:rPr>
+          <w:rFonts w:ascii="Arial" w:hAnsi="Arial" w:cs="Arial"/>
+        </w:rPr>
+      </w:pPr>
+    </w:p>
+    <w:p>
+      <w:pPr>
+        <w:rPr>
+          <w:rFonts w:ascii="Arial" w:hAnsi="Arial" w:cs="Arial"/>
+        </w:rPr>
+      </w:pPr>
+    </w:p>
+    <w:p>
+      <w:pPr>
+        <w:rPr>
+          <w:rFonts w:ascii="Arial" w:hAnsi="Arial" w:cs="Arial"/>
+        </w:rPr>
+      </w:pPr>
+    </w:p>
+    <w:p>
+      <w:pPr>
+        <w:rPr>
+          <w:rFonts w:ascii="Arial" w:hAnsi="Arial" w:cs="Arial"/>
+        </w:rPr>
+      </w:pPr>
+    </w:p>
+    <w:p>
+      <w:pPr>
+        <w:rPr>
+          <w:rFonts w:ascii="Arial" w:hAnsi="Arial" w:cs="Arial"/>
+        </w:rPr>
+      </w:pPr>
+      <w:r>
+        <w:rPr>
+          <w:rFonts w:ascii="Arial" w:hAnsi="Arial" w:cs="Arial"/>
+        </w:rPr>
         <w:t>Tenint això en ment, definir la següent heurísitica h_bcn seria una manera (inicial) d’afrontar aquestes restriccions dels altres dos algoritmes.</w:t>
       </w:r>
     </w:p>
@@ -1116,6 +1912,12 @@
           <w:rFonts w:ascii="Arial" w:hAnsi="Arial" w:cs="Arial"/>
         </w:rPr>
         <w:t>Pensant en una heurística centrada en aquestes característiques</w:t>
+      </w:r>
+      <w:r>
+        <w:rPr>
+          <w:rFonts w:ascii="Arial" w:hAnsi="Arial" w:cs="Arial"/>
+        </w:rPr>
+        <w:t>,…</w:t>
       </w:r>
     </w:p>
     <w:p>
@@ -1405,6 +2207,92 @@
     </w:lvl>
   </w:abstractNum>
   <w:abstractNum w:abstractNumId="3" w15:restartNumberingAfterBreak="0">
+    <w:nsid w:val="3AA041F5"/>
+    <w:multiLevelType w:val="hybridMultilevel"/>
+    <w:tmpl w:val="50E00610"/>
+    <w:lvl w:ilvl="0" w:tplc="08090019">
+      <w:start w:val="1"/>
+      <w:numFmt w:val="lowerLetter"/>
+      <w:lvlText w:val="%1."/>
+      <w:lvlJc w:val="left"/>
+      <w:pPr>
+        <w:ind w:left="1440" w:hanging="360"/>
+      </w:pPr>
+    </w:lvl>
+    <w:lvl w:ilvl="1" w:tplc="08090019" w:tentative="1">
+      <w:start w:val="1"/>
+      <w:numFmt w:val="lowerLetter"/>
+      <w:lvlText w:val="%2."/>
+      <w:lvlJc w:val="left"/>
+      <w:pPr>
+        <w:ind w:left="2160" w:hanging="360"/>
+      </w:pPr>
+    </w:lvl>
+    <w:lvl w:ilvl="2" w:tplc="0809001B" w:tentative="1">
+      <w:start w:val="1"/>
+      <w:numFmt w:val="lowerRoman"/>
+      <w:lvlText w:val="%3."/>
+      <w:lvlJc w:val="right"/>
+      <w:pPr>
+        <w:ind w:left="2880" w:hanging="180"/>
+      </w:pPr>
+    </w:lvl>
+    <w:lvl w:ilvl="3" w:tplc="0809000F" w:tentative="1">
+      <w:start w:val="1"/>
+      <w:numFmt w:val="decimal"/>
+      <w:lvlText w:val="%4."/>
+      <w:lvlJc w:val="left"/>
+      <w:pPr>
+        <w:ind w:left="3600" w:hanging="360"/>
+      </w:pPr>
+    </w:lvl>
+    <w:lvl w:ilvl="4" w:tplc="08090019" w:tentative="1">
+      <w:start w:val="1"/>
+      <w:numFmt w:val="lowerLetter"/>
+      <w:lvlText w:val="%5."/>
+      <w:lvlJc w:val="left"/>
+      <w:pPr>
+        <w:ind w:left="4320" w:hanging="360"/>
+      </w:pPr>
+    </w:lvl>
+    <w:lvl w:ilvl="5" w:tplc="0809001B" w:tentative="1">
+      <w:start w:val="1"/>
+      <w:numFmt w:val="lowerRoman"/>
+      <w:lvlText w:val="%6."/>
+      <w:lvlJc w:val="right"/>
+      <w:pPr>
+        <w:ind w:left="5040" w:hanging="180"/>
+      </w:pPr>
+    </w:lvl>
+    <w:lvl w:ilvl="6" w:tplc="0809000F" w:tentative="1">
+      <w:start w:val="1"/>
+      <w:numFmt w:val="decimal"/>
+      <w:lvlText w:val="%7."/>
+      <w:lvlJc w:val="left"/>
+      <w:pPr>
+        <w:ind w:left="5760" w:hanging="360"/>
+      </w:pPr>
+    </w:lvl>
+    <w:lvl w:ilvl="7" w:tplc="08090019" w:tentative="1">
+      <w:start w:val="1"/>
+      <w:numFmt w:val="lowerLetter"/>
+      <w:lvlText w:val="%8."/>
+      <w:lvlJc w:val="left"/>
+      <w:pPr>
+        <w:ind w:left="6480" w:hanging="360"/>
+      </w:pPr>
+    </w:lvl>
+    <w:lvl w:ilvl="8" w:tplc="0809001B" w:tentative="1">
+      <w:start w:val="1"/>
+      <w:numFmt w:val="lowerRoman"/>
+      <w:lvlText w:val="%9."/>
+      <w:lvlJc w:val="right"/>
+      <w:pPr>
+        <w:ind w:left="7200" w:hanging="180"/>
+      </w:pPr>
+    </w:lvl>
+  </w:abstractNum>
+  <w:abstractNum w:abstractNumId="4" w15:restartNumberingAfterBreak="0">
     <w:nsid w:val="4DE226C8"/>
     <w:multiLevelType w:val="hybridMultilevel"/>
     <w:tmpl w:val="34DC5D98"/>
@@ -1493,7 +2381,7 @@
       </w:pPr>
     </w:lvl>
   </w:abstractNum>
-  <w:abstractNum w:abstractNumId="4" w15:restartNumberingAfterBreak="0">
+  <w:abstractNum w:abstractNumId="5" w15:restartNumberingAfterBreak="0">
     <w:nsid w:val="5497707C"/>
     <w:multiLevelType w:val="hybridMultilevel"/>
     <w:tmpl w:val="44F4BA1E"/>
@@ -1606,7 +2494,7 @@
     </w:lvl>
   </w:abstractNum>
   <w:num w:numId="1" w16cid:durableId="1180579750">
-    <w:abstractNumId w:val="3"/>
+    <w:abstractNumId w:val="4"/>
   </w:num>
   <w:num w:numId="2" w16cid:durableId="1568301481">
     <w:abstractNumId w:val="2"/>
@@ -1618,7 +2506,10 @@
     <w:abstractNumId w:val="0"/>
   </w:num>
   <w:num w:numId="5" w16cid:durableId="1915167292">
-    <w:abstractNumId w:val="4"/>
+    <w:abstractNumId w:val="5"/>
+  </w:num>
+  <w:num w:numId="6" w16cid:durableId="1766805513">
+    <w:abstractNumId w:val="3"/>
   </w:num>
 </w:numbering>
 </file>

</xml_diff>